<commit_message>
Revisi file laporan Word dan PDF
</commit_message>
<xml_diff>
--- a/10123265_10123057_10123053_10123313_10123332_TubesDIPL1.docx
+++ b/10123265_10123057_10123053_10123313_10123332_TubesDIPL1.docx
@@ -498,17 +498,8 @@
           <w:rFonts w:ascii="Times New Roman" w:hAnsi="Times New Roman" w:cs="Times New Roman"/>
           <w:lang w:val="en-US"/>
         </w:rPr>
-        <w:t xml:space="preserve"> </w:t>
-      </w:r>
-      <w:proofErr w:type="gramStart"/>
-      <w:r>
-        <w:rPr>
-          <w:rFonts w:ascii="Times New Roman" w:hAnsi="Times New Roman" w:cs="Times New Roman"/>
-          <w:lang w:val="en-US"/>
-        </w:rPr>
-        <w:t>Oleh :</w:t>
-      </w:r>
-      <w:proofErr w:type="gramEnd"/>
+        <w:t xml:space="preserve"> Oleh :</w:t>
+      </w:r>
     </w:p>
     <w:p>
       <w:pPr>
@@ -16564,7 +16555,7 @@
           <w:noProof/>
         </w:rPr>
         <w:drawing>
-          <wp:anchor distT="0" distB="0" distL="114300" distR="114300" simplePos="0" relativeHeight="251653120" behindDoc="0" locked="0" layoutInCell="1" allowOverlap="1" wp14:anchorId="1615FC88" wp14:editId="42B5AD71">
+          <wp:anchor distT="0" distB="0" distL="114300" distR="114300" simplePos="0" relativeHeight="251653120" behindDoc="0" locked="0" layoutInCell="1" allowOverlap="1" wp14:anchorId="1615FC88" wp14:editId="6E471368">
             <wp:simplePos x="0" y="0"/>
             <wp:positionH relativeFrom="column">
               <wp:posOffset>1091413</wp:posOffset>
@@ -16752,7 +16743,21 @@
         <w:rPr>
           <w:rFonts w:ascii="Times New Roman" w:hAnsi="Times New Roman" w:cs="Times New Roman"/>
         </w:rPr>
-        <w:t xml:space="preserve">, dan dirasakan oleh pengguna saat berhadapan dengan metode pembelajaran konvensional. Diagram ini mengonfirmasi bahwa rasa frustrasi pengguna bersumber dari media statis, </w:t>
+        <w:t xml:space="preserve">, dan dirasakan oleh pengguna saat berhadapan dengan metode pembelajaran konvensional. Diagram ini mengonfirmasi bahwa rasa frustrasi pengguna bersumber </w:t>
+      </w:r>
+      <w:proofErr w:type="spellStart"/>
+      <w:r>
+        <w:rPr>
+          <w:rFonts w:ascii="Times New Roman" w:hAnsi="Times New Roman" w:cs="Times New Roman"/>
+        </w:rPr>
+        <w:t>dari</w:t>
+      </w:r>
+      <w:proofErr w:type="spellEnd"/>
+      <w:r>
+        <w:rPr>
+          <w:rFonts w:ascii="Times New Roman" w:hAnsi="Times New Roman" w:cs="Times New Roman"/>
+        </w:rPr>
+        <w:t xml:space="preserve"> media statis, </w:t>
       </w:r>
       <w:proofErr w:type="spellStart"/>
       <w:r>
@@ -18703,7 +18708,6 @@
                                 </w:rPr>
                                 <w:t xml:space="preserve">User Flow </w:t>
                               </w:r>
-                              <w:proofErr w:type="spellStart"/>
                               <w:r>
                                 <w:rPr>
                                   <w:rFonts w:ascii="Times New Roman" w:hAnsi="Times New Roman" w:cs="Times New Roman"/>
@@ -18712,18 +18716,7 @@
                                   <w:color w:val="auto"/>
                                   <w:szCs w:val="24"/>
                                 </w:rPr>
-                                <w:t>Navigasi</w:t>
-                              </w:r>
-                              <w:proofErr w:type="spellEnd"/>
-                              <w:r>
-                                <w:rPr>
-                                  <w:rFonts w:ascii="Times New Roman" w:hAnsi="Times New Roman" w:cs="Times New Roman"/>
-                                  <w:i/>
-                                  <w:iCs w:val="0"/>
-                                  <w:color w:val="auto"/>
-                                  <w:szCs w:val="24"/>
-                                </w:rPr>
-                                <w:t xml:space="preserve"> Beranda Utama</w:t>
+                                <w:t>Navigasi Beranda Utama</w:t>
                               </w:r>
                               <w:bookmarkEnd w:id="55"/>
                             </w:p>
@@ -18821,7 +18814,6 @@
                           </w:rPr>
                           <w:t xml:space="preserve">User Flow </w:t>
                         </w:r>
-                        <w:proofErr w:type="spellStart"/>
                         <w:r>
                           <w:rPr>
                             <w:rFonts w:ascii="Times New Roman" w:hAnsi="Times New Roman" w:cs="Times New Roman"/>
@@ -18830,18 +18822,7 @@
                             <w:color w:val="auto"/>
                             <w:szCs w:val="24"/>
                           </w:rPr>
-                          <w:t>Navigasi</w:t>
-                        </w:r>
-                        <w:proofErr w:type="spellEnd"/>
-                        <w:r>
-                          <w:rPr>
-                            <w:rFonts w:ascii="Times New Roman" w:hAnsi="Times New Roman" w:cs="Times New Roman"/>
-                            <w:i/>
-                            <w:iCs w:val="0"/>
-                            <w:color w:val="auto"/>
-                            <w:szCs w:val="24"/>
-                          </w:rPr>
-                          <w:t xml:space="preserve"> Beranda Utama</w:t>
+                          <w:t>Navigasi Beranda Utama</w:t>
                         </w:r>
                         <w:bookmarkEnd w:id="56"/>
                       </w:p>
@@ -19044,7 +19025,6 @@
                               </w:rPr>
                               <w:t xml:space="preserve">User Flow Proses </w:t>
                             </w:r>
-                            <w:proofErr w:type="spellStart"/>
                             <w:r>
                               <w:rPr>
                                 <w:rFonts w:ascii="Times New Roman" w:hAnsi="Times New Roman" w:cs="Times New Roman"/>
@@ -19053,18 +19033,7 @@
                                 <w:color w:val="auto"/>
                                 <w:szCs w:val="24"/>
                               </w:rPr>
-                              <w:t>Pemindaian</w:t>
-                            </w:r>
-                            <w:proofErr w:type="spellEnd"/>
-                            <w:r>
-                              <w:rPr>
-                                <w:rFonts w:ascii="Times New Roman" w:hAnsi="Times New Roman" w:cs="Times New Roman"/>
-                                <w:i/>
-                                <w:iCs w:val="0"/>
-                                <w:color w:val="auto"/>
-                                <w:szCs w:val="24"/>
-                              </w:rPr>
-                              <w:t xml:space="preserve"> (Scanning) dan Error</w:t>
+                              <w:t>Pemindaian (Scanning) dan Error</w:t>
                             </w:r>
                             <w:bookmarkEnd w:id="57"/>
                           </w:p>
@@ -19132,7 +19101,6 @@
                         </w:rPr>
                         <w:t xml:space="preserve">User Flow Proses </w:t>
                       </w:r>
-                      <w:proofErr w:type="spellStart"/>
                       <w:r>
                         <w:rPr>
                           <w:rFonts w:ascii="Times New Roman" w:hAnsi="Times New Roman" w:cs="Times New Roman"/>
@@ -19141,18 +19109,7 @@
                           <w:color w:val="auto"/>
                           <w:szCs w:val="24"/>
                         </w:rPr>
-                        <w:t>Pemindaian</w:t>
-                      </w:r>
-                      <w:proofErr w:type="spellEnd"/>
-                      <w:r>
-                        <w:rPr>
-                          <w:rFonts w:ascii="Times New Roman" w:hAnsi="Times New Roman" w:cs="Times New Roman"/>
-                          <w:i/>
-                          <w:iCs w:val="0"/>
-                          <w:color w:val="auto"/>
-                          <w:szCs w:val="24"/>
-                        </w:rPr>
-                        <w:t xml:space="preserve"> (Scanning) dan Error</w:t>
+                        <w:t>Pemindaian (Scanning) dan Error</w:t>
                       </w:r>
                       <w:bookmarkEnd w:id="58"/>
                     </w:p>
@@ -19379,7 +19336,6 @@
                               </w:rPr>
                               <w:t xml:space="preserve">User Flow </w:t>
                             </w:r>
-                            <w:proofErr w:type="spellStart"/>
                             <w:r>
                               <w:rPr>
                                 <w:rFonts w:ascii="Times New Roman" w:hAnsi="Times New Roman" w:cs="Times New Roman"/>
@@ -19388,76 +19344,9 @@
                                 <w:color w:val="auto"/>
                                 <w:szCs w:val="24"/>
                               </w:rPr>
-                              <w:t>Interaksi</w:t>
-                            </w:r>
-                            <w:proofErr w:type="spellEnd"/>
-                            <w:r>
-                              <w:rPr>
-                                <w:rFonts w:ascii="Times New Roman" w:hAnsi="Times New Roman" w:cs="Times New Roman"/>
-                                <w:i/>
-                                <w:iCs w:val="0"/>
-                                <w:color w:val="auto"/>
-                                <w:szCs w:val="24"/>
-                              </w:rPr>
-                              <w:t xml:space="preserve"> AR </w:t>
-                            </w:r>
-                            <w:proofErr w:type="spellStart"/>
-                            <w:r>
-                              <w:rPr>
-                                <w:rFonts w:ascii="Times New Roman" w:hAnsi="Times New Roman" w:cs="Times New Roman"/>
-                                <w:i/>
-                                <w:iCs w:val="0"/>
-                                <w:color w:val="auto"/>
-                                <w:szCs w:val="24"/>
-                              </w:rPr>
-                              <w:t>Aktif</w:t>
-                            </w:r>
-                            <w:proofErr w:type="spellEnd"/>
-                            <w:r>
-                              <w:rPr>
-                                <w:rFonts w:ascii="Times New Roman" w:hAnsi="Times New Roman" w:cs="Times New Roman"/>
-                                <w:i/>
-                                <w:iCs w:val="0"/>
-                                <w:color w:val="auto"/>
-                                <w:szCs w:val="24"/>
-                              </w:rPr>
-                              <w:t xml:space="preserve"> &amp; </w:t>
-                            </w:r>
-                            <w:proofErr w:type="spellStart"/>
-                            <w:r>
-                              <w:rPr>
-                                <w:rFonts w:ascii="Times New Roman" w:hAnsi="Times New Roman" w:cs="Times New Roman"/>
-                                <w:i/>
-                                <w:iCs w:val="0"/>
-                                <w:color w:val="auto"/>
-                                <w:szCs w:val="24"/>
-                              </w:rPr>
-                              <w:t>Navigasi</w:t>
-                            </w:r>
-                            <w:proofErr w:type="spellEnd"/>
-                            <w:r>
-                              <w:rPr>
-                                <w:rFonts w:ascii="Times New Roman" w:hAnsi="Times New Roman" w:cs="Times New Roman"/>
-                                <w:i/>
-                                <w:iCs w:val="0"/>
-                                <w:color w:val="auto"/>
-                                <w:szCs w:val="24"/>
-                              </w:rPr>
-                              <w:t xml:space="preserve"> </w:t>
-                            </w:r>
-                            <w:proofErr w:type="spellStart"/>
-                            <w:r>
-                              <w:rPr>
-                                <w:rFonts w:ascii="Times New Roman" w:hAnsi="Times New Roman" w:cs="Times New Roman"/>
-                                <w:i/>
-                                <w:iCs w:val="0"/>
-                                <w:color w:val="auto"/>
-                                <w:szCs w:val="24"/>
-                              </w:rPr>
-                              <w:t>Keluar</w:t>
+                              <w:t>Interaksi AR Aktif &amp; Navigasi Keluar</w:t>
                             </w:r>
                             <w:bookmarkEnd w:id="59"/>
-                            <w:proofErr w:type="spellEnd"/>
                           </w:p>
                         </w:txbxContent>
                       </wps:txbx>
@@ -19523,7 +19412,6 @@
                         </w:rPr>
                         <w:t xml:space="preserve">User Flow </w:t>
                       </w:r>
-                      <w:proofErr w:type="spellStart"/>
                       <w:r>
                         <w:rPr>
                           <w:rFonts w:ascii="Times New Roman" w:hAnsi="Times New Roman" w:cs="Times New Roman"/>
@@ -19532,76 +19420,9 @@
                           <w:color w:val="auto"/>
                           <w:szCs w:val="24"/>
                         </w:rPr>
-                        <w:t>Interaksi</w:t>
-                      </w:r>
-                      <w:proofErr w:type="spellEnd"/>
-                      <w:r>
-                        <w:rPr>
-                          <w:rFonts w:ascii="Times New Roman" w:hAnsi="Times New Roman" w:cs="Times New Roman"/>
-                          <w:i/>
-                          <w:iCs w:val="0"/>
-                          <w:color w:val="auto"/>
-                          <w:szCs w:val="24"/>
-                        </w:rPr>
-                        <w:t xml:space="preserve"> AR </w:t>
-                      </w:r>
-                      <w:proofErr w:type="spellStart"/>
-                      <w:r>
-                        <w:rPr>
-                          <w:rFonts w:ascii="Times New Roman" w:hAnsi="Times New Roman" w:cs="Times New Roman"/>
-                          <w:i/>
-                          <w:iCs w:val="0"/>
-                          <w:color w:val="auto"/>
-                          <w:szCs w:val="24"/>
-                        </w:rPr>
-                        <w:t>Aktif</w:t>
-                      </w:r>
-                      <w:proofErr w:type="spellEnd"/>
-                      <w:r>
-                        <w:rPr>
-                          <w:rFonts w:ascii="Times New Roman" w:hAnsi="Times New Roman" w:cs="Times New Roman"/>
-                          <w:i/>
-                          <w:iCs w:val="0"/>
-                          <w:color w:val="auto"/>
-                          <w:szCs w:val="24"/>
-                        </w:rPr>
-                        <w:t xml:space="preserve"> &amp; </w:t>
-                      </w:r>
-                      <w:proofErr w:type="spellStart"/>
-                      <w:r>
-                        <w:rPr>
-                          <w:rFonts w:ascii="Times New Roman" w:hAnsi="Times New Roman" w:cs="Times New Roman"/>
-                          <w:i/>
-                          <w:iCs w:val="0"/>
-                          <w:color w:val="auto"/>
-                          <w:szCs w:val="24"/>
-                        </w:rPr>
-                        <w:t>Navigasi</w:t>
-                      </w:r>
-                      <w:proofErr w:type="spellEnd"/>
-                      <w:r>
-                        <w:rPr>
-                          <w:rFonts w:ascii="Times New Roman" w:hAnsi="Times New Roman" w:cs="Times New Roman"/>
-                          <w:i/>
-                          <w:iCs w:val="0"/>
-                          <w:color w:val="auto"/>
-                          <w:szCs w:val="24"/>
-                        </w:rPr>
-                        <w:t xml:space="preserve"> </w:t>
-                      </w:r>
-                      <w:proofErr w:type="spellStart"/>
-                      <w:r>
-                        <w:rPr>
-                          <w:rFonts w:ascii="Times New Roman" w:hAnsi="Times New Roman" w:cs="Times New Roman"/>
-                          <w:i/>
-                          <w:iCs w:val="0"/>
-                          <w:color w:val="auto"/>
-                          <w:szCs w:val="24"/>
-                        </w:rPr>
-                        <w:t>Keluar</w:t>
+                        <w:t>Interaksi AR Aktif &amp; Navigasi Keluar</w:t>
                       </w:r>
                       <w:bookmarkEnd w:id="60"/>
-                      <w:proofErr w:type="spellEnd"/>
                     </w:p>
                   </w:txbxContent>
                 </v:textbox>
@@ -20264,7 +20085,6 @@
                                 <w:szCs w:val="6"/>
                               </w:rPr>
                             </w:pPr>
-                            <w:proofErr w:type="spellStart"/>
                             <w:r>
                               <w:rPr>
                                 <w:rFonts w:ascii="Sans Serif Collection" w:hAnsi="Sans Serif Collection" w:cs="Sans Serif Collection"/>
@@ -20272,17 +20092,7 @@
                                 <w:sz w:val="6"/>
                                 <w:szCs w:val="6"/>
                               </w:rPr>
-                              <w:t>Mulai</w:t>
-                            </w:r>
-                            <w:proofErr w:type="spellEnd"/>
-                            <w:r>
-                              <w:rPr>
-                                <w:rFonts w:ascii="Sans Serif Collection" w:hAnsi="Sans Serif Collection" w:cs="Sans Serif Collection"/>
-                                <w:color w:val="000000" w:themeColor="text1"/>
-                                <w:sz w:val="6"/>
-                                <w:szCs w:val="6"/>
-                              </w:rPr>
-                              <w:t xml:space="preserve"> Scan Kartu</w:t>
+                              <w:t>Mulai Scan Kartu</w:t>
                             </w:r>
                           </w:p>
                         </w:txbxContent>
@@ -20320,7 +20130,6 @@
                           <w:szCs w:val="6"/>
                         </w:rPr>
                       </w:pPr>
-                      <w:proofErr w:type="spellStart"/>
                       <w:r>
                         <w:rPr>
                           <w:rFonts w:ascii="Sans Serif Collection" w:hAnsi="Sans Serif Collection" w:cs="Sans Serif Collection"/>
@@ -20328,17 +20137,7 @@
                           <w:sz w:val="6"/>
                           <w:szCs w:val="6"/>
                         </w:rPr>
-                        <w:t>Mulai</w:t>
-                      </w:r>
-                      <w:proofErr w:type="spellEnd"/>
-                      <w:r>
-                        <w:rPr>
-                          <w:rFonts w:ascii="Sans Serif Collection" w:hAnsi="Sans Serif Collection" w:cs="Sans Serif Collection"/>
-                          <w:color w:val="000000" w:themeColor="text1"/>
-                          <w:sz w:val="6"/>
-                          <w:szCs w:val="6"/>
-                        </w:rPr>
-                        <w:t xml:space="preserve"> Scan Kartu</w:t>
+                        <w:t>Mulai Scan Kartu</w:t>
                       </w:r>
                     </w:p>
                   </w:txbxContent>
@@ -20354,7 +20153,7 @@
           <w:noProof/>
         </w:rPr>
         <w:drawing>
-          <wp:anchor distT="0" distB="0" distL="114300" distR="114300" simplePos="0" relativeHeight="251674624" behindDoc="0" locked="0" layoutInCell="1" allowOverlap="1" wp14:anchorId="18E463A4" wp14:editId="42D36425">
+          <wp:anchor distT="0" distB="0" distL="114300" distR="114300" simplePos="0" relativeHeight="251674624" behindDoc="0" locked="0" layoutInCell="1" allowOverlap="1" wp14:anchorId="18E463A4" wp14:editId="409D515C">
             <wp:simplePos x="0" y="0"/>
             <wp:positionH relativeFrom="column">
               <wp:posOffset>526415</wp:posOffset>
@@ -22718,7 +22517,35 @@
         <w:rPr>
           <w:rFonts w:ascii="Times New Roman" w:hAnsi="Times New Roman" w:cs="Times New Roman"/>
         </w:rPr>
-        <w:t xml:space="preserve"> secara berkala untuk memperbarui database marker flashcard atau mengunduh aset 3D baru. Penggunaan harian saat memindai kartu dapat berjalan secara offline.</w:t>
+        <w:t xml:space="preserve"> </w:t>
+      </w:r>
+      <w:proofErr w:type="spellStart"/>
+      <w:r>
+        <w:rPr>
+          <w:rFonts w:ascii="Times New Roman" w:hAnsi="Times New Roman" w:cs="Times New Roman"/>
+        </w:rPr>
+        <w:t>secara</w:t>
+      </w:r>
+      <w:proofErr w:type="spellEnd"/>
+      <w:r>
+        <w:rPr>
+          <w:rFonts w:ascii="Times New Roman" w:hAnsi="Times New Roman" w:cs="Times New Roman"/>
+        </w:rPr>
+        <w:t xml:space="preserve"> </w:t>
+      </w:r>
+      <w:proofErr w:type="spellStart"/>
+      <w:r>
+        <w:rPr>
+          <w:rFonts w:ascii="Times New Roman" w:hAnsi="Times New Roman" w:cs="Times New Roman"/>
+        </w:rPr>
+        <w:t>berkala</w:t>
+      </w:r>
+      <w:proofErr w:type="spellEnd"/>
+      <w:r>
+        <w:rPr>
+          <w:rFonts w:ascii="Times New Roman" w:hAnsi="Times New Roman" w:cs="Times New Roman"/>
+        </w:rPr>
+        <w:t xml:space="preserve"> untuk memperbarui database marker flashcard atau mengunduh aset 3D baru. Penggunaan harian saat memindai kartu dapat berjalan secara offline.</w:t>
       </w:r>
     </w:p>
     <w:p>
@@ -22891,7 +22718,7 @@
           <w:noProof/>
         </w:rPr>
         <w:drawing>
-          <wp:anchor distT="0" distB="0" distL="114300" distR="114300" simplePos="0" relativeHeight="251676672" behindDoc="0" locked="0" layoutInCell="1" allowOverlap="1" wp14:anchorId="58FB3A06" wp14:editId="13EE94E9">
+          <wp:anchor distT="0" distB="0" distL="114300" distR="114300" simplePos="0" relativeHeight="251676672" behindDoc="0" locked="0" layoutInCell="1" allowOverlap="1" wp14:anchorId="58FB3A06" wp14:editId="13125040">
             <wp:simplePos x="0" y="0"/>
             <wp:positionH relativeFrom="column">
               <wp:posOffset>949960</wp:posOffset>
@@ -24275,7 +24102,35 @@
         <w:rPr>
           <w:rFonts w:ascii="Times New Roman" w:hAnsi="Times New Roman" w:cs="Times New Roman"/>
         </w:rPr>
-        <w:t xml:space="preserve">Penerapan Fitur Deteksi Objek Pintar: Pada pengembangan jangka panjang, aplikasi disarankan untuk mulai mengadopsi teknologi Machine Learning. Dengan begitu, pengguna tidak perlu lagi bergantung penuh pada flashcard fisik; mereka bisa langsung menyorot kamera ke benda asli di sekitar mereka (misalnya menyorot kursi atau gelas) dan aplikasi </w:t>
+        <w:t xml:space="preserve">Penerapan Fitur Deteksi Objek Pintar: Pada pengembangan jangka panjang, aplikasi disarankan untuk mulai mengadopsi teknologi Machine Learning. Dengan begitu, pengguna tidak perlu lagi bergantung penuh pada flashcard fisik; mereka bisa langsung menyorot kamera ke benda asli di sekitar mereka (misalnya menyorot kursi atau </w:t>
+      </w:r>
+      <w:proofErr w:type="spellStart"/>
+      <w:r>
+        <w:rPr>
+          <w:rFonts w:ascii="Times New Roman" w:hAnsi="Times New Roman" w:cs="Times New Roman"/>
+        </w:rPr>
+        <w:t>gelas</w:t>
+      </w:r>
+      <w:proofErr w:type="spellEnd"/>
+      <w:r>
+        <w:rPr>
+          <w:rFonts w:ascii="Times New Roman" w:hAnsi="Times New Roman" w:cs="Times New Roman"/>
+        </w:rPr>
+        <w:t xml:space="preserve">) dan </w:t>
+      </w:r>
+      <w:proofErr w:type="spellStart"/>
+      <w:r>
+        <w:rPr>
+          <w:rFonts w:ascii="Times New Roman" w:hAnsi="Times New Roman" w:cs="Times New Roman"/>
+        </w:rPr>
+        <w:t>aplikasi</w:t>
+      </w:r>
+      <w:proofErr w:type="spellEnd"/>
+      <w:r>
+        <w:rPr>
+          <w:rFonts w:ascii="Times New Roman" w:hAnsi="Times New Roman" w:cs="Times New Roman"/>
+        </w:rPr>
+        <w:t xml:space="preserve"> </w:t>
       </w:r>
       <w:proofErr w:type="spellStart"/>
       <w:r>
@@ -25517,6 +25372,15 @@
           <w:rFonts w:ascii="Times New Roman" w:hAnsi="Times New Roman" w:cs="Times New Roman"/>
         </w:rPr>
         <w:t>LINK REPOSITORI (GITHUB):</w:t>
+      </w:r>
+      <w:r>
+        <w:t xml:space="preserve"> </w:t>
+      </w:r>
+      <w:r>
+        <w:rPr>
+          <w:rFonts w:ascii="Times New Roman" w:hAnsi="Times New Roman" w:cs="Times New Roman"/>
+        </w:rPr>
+        <w:t>https://github.com/RafaelRangga/Tugas-Besar-AR-Isyarat-DIPL1.git</w:t>
       </w:r>
     </w:p>
     <w:p>
@@ -25955,7 +25819,7 @@
         </w:rPr>
         <w:lastRenderedPageBreak/>
         <w:drawing>
-          <wp:anchor distT="0" distB="0" distL="114300" distR="114300" simplePos="0" relativeHeight="251729920" behindDoc="0" locked="0" layoutInCell="1" allowOverlap="1" wp14:anchorId="37B051E7" wp14:editId="56D02A9B">
+          <wp:anchor distT="0" distB="0" distL="114300" distR="114300" simplePos="0" relativeHeight="251729920" behindDoc="0" locked="0" layoutInCell="1" allowOverlap="1" wp14:anchorId="37B051E7" wp14:editId="2B3B0A99">
             <wp:simplePos x="0" y="0"/>
             <wp:positionH relativeFrom="column">
               <wp:posOffset>0</wp:posOffset>
@@ -26010,7 +25874,7 @@
           <w:noProof/>
         </w:rPr>
         <w:drawing>
-          <wp:anchor distT="0" distB="0" distL="114300" distR="114300" simplePos="0" relativeHeight="251720704" behindDoc="0" locked="0" layoutInCell="1" allowOverlap="1" wp14:anchorId="33EC4EA4" wp14:editId="00F1204B">
+          <wp:anchor distT="0" distB="0" distL="114300" distR="114300" simplePos="0" relativeHeight="251720704" behindDoc="0" locked="0" layoutInCell="1" allowOverlap="1" wp14:anchorId="33EC4EA4" wp14:editId="6E9D7FC1">
             <wp:simplePos x="0" y="0"/>
             <wp:positionH relativeFrom="column">
               <wp:posOffset>0</wp:posOffset>
@@ -33009,6 +32873,7 @@
   <w:style w:type="character" w:default="1" w:styleId="DefaultParagraphFont">
     <w:name w:val="Default Paragraph Font"/>
     <w:uiPriority w:val="1"/>
+    <w:semiHidden/>
     <w:unhideWhenUsed/>
   </w:style>
   <w:style w:type="table" w:default="1" w:styleId="TableNormal">

</xml_diff>

<commit_message>
Revisi Laporan+PPT Tugas Besat DIPL
</commit_message>
<xml_diff>
--- a/10123265_10123057_10123053_10123313_10123332_TubesDIPL1.docx
+++ b/10123265_10123057_10123053_10123313_10123332_TubesDIPL1.docx
@@ -1547,7 +1547,7 @@
                 <w:noProof/>
                 <w:webHidden/>
               </w:rPr>
-              <w:t>1</w:t>
+              <w:t>2</w:t>
             </w:r>
             <w:r>
               <w:rPr>
@@ -1670,7 +1670,7 @@
                 <w:noProof/>
                 <w:webHidden/>
               </w:rPr>
-              <w:t>1</w:t>
+              <w:t>2</w:t>
             </w:r>
             <w:r>
               <w:rPr>
@@ -1815,7 +1815,7 @@
                 <w:noProof/>
                 <w:webHidden/>
               </w:rPr>
-              <w:t>1</w:t>
+              <w:t>3</w:t>
             </w:r>
             <w:r>
               <w:rPr>
@@ -1940,7 +1940,7 @@
                 <w:noProof/>
                 <w:webHidden/>
               </w:rPr>
-              <w:t>1</w:t>
+              <w:t>3</w:t>
             </w:r>
             <w:r>
               <w:rPr>
@@ -2063,7 +2063,7 @@
                 <w:noProof/>
                 <w:webHidden/>
               </w:rPr>
-              <w:t>1</w:t>
+              <w:t>3</w:t>
             </w:r>
             <w:r>
               <w:rPr>
@@ -2186,7 +2186,7 @@
                 <w:noProof/>
                 <w:webHidden/>
               </w:rPr>
-              <w:t>1</w:t>
+              <w:t>3</w:t>
             </w:r>
             <w:r>
               <w:rPr>
@@ -2309,7 +2309,7 @@
                 <w:noProof/>
                 <w:webHidden/>
               </w:rPr>
-              <w:t>1</w:t>
+              <w:t>3</w:t>
             </w:r>
             <w:r>
               <w:rPr>
@@ -2432,7 +2432,7 @@
                 <w:noProof/>
                 <w:webHidden/>
               </w:rPr>
-              <w:t>1</w:t>
+              <w:t>4</w:t>
             </w:r>
             <w:r>
               <w:rPr>
@@ -2555,7 +2555,7 @@
                 <w:noProof/>
                 <w:webHidden/>
               </w:rPr>
-              <w:t>1</w:t>
+              <w:t>5</w:t>
             </w:r>
             <w:r>
               <w:rPr>
@@ -2678,7 +2678,7 @@
                 <w:noProof/>
                 <w:webHidden/>
               </w:rPr>
-              <w:t>1</w:t>
+              <w:t>5</w:t>
             </w:r>
             <w:r>
               <w:rPr>
@@ -2801,7 +2801,7 @@
                 <w:noProof/>
                 <w:webHidden/>
               </w:rPr>
-              <w:t>1</w:t>
+              <w:t>6</w:t>
             </w:r>
             <w:r>
               <w:rPr>
@@ -2946,7 +2946,7 @@
                 <w:noProof/>
                 <w:webHidden/>
               </w:rPr>
-              <w:t>1</w:t>
+              <w:t>7</w:t>
             </w:r>
             <w:r>
               <w:rPr>
@@ -3071,7 +3071,7 @@
                 <w:noProof/>
                 <w:webHidden/>
               </w:rPr>
-              <w:t>1</w:t>
+              <w:t>7</w:t>
             </w:r>
             <w:r>
               <w:rPr>
@@ -3194,7 +3194,7 @@
                 <w:noProof/>
                 <w:webHidden/>
               </w:rPr>
-              <w:t>1</w:t>
+              <w:t>12</w:t>
             </w:r>
             <w:r>
               <w:rPr>
@@ -3317,7 +3317,7 @@
                 <w:noProof/>
                 <w:webHidden/>
               </w:rPr>
-              <w:t>1</w:t>
+              <w:t>22</w:t>
             </w:r>
             <w:r>
               <w:rPr>
@@ -3440,7 +3440,7 @@
                 <w:noProof/>
                 <w:webHidden/>
               </w:rPr>
-              <w:t>1</w:t>
+              <w:t>24</w:t>
             </w:r>
             <w:r>
               <w:rPr>
@@ -3585,7 +3585,7 @@
                 <w:noProof/>
                 <w:webHidden/>
               </w:rPr>
-              <w:t>1</w:t>
+              <w:t>28</w:t>
             </w:r>
             <w:r>
               <w:rPr>
@@ -3708,7 +3708,7 @@
                 <w:noProof/>
                 <w:webHidden/>
               </w:rPr>
-              <w:t>1</w:t>
+              <w:t>28</w:t>
             </w:r>
             <w:r>
               <w:rPr>
@@ -3829,7 +3829,7 @@
                 <w:noProof/>
                 <w:webHidden/>
               </w:rPr>
-              <w:t>1</w:t>
+              <w:t>28</w:t>
             </w:r>
             <w:r>
               <w:rPr>
@@ -3945,7 +3945,7 @@
                 <w:noProof/>
                 <w:webHidden/>
               </w:rPr>
-              <w:t>1</w:t>
+              <w:t>30</w:t>
             </w:r>
             <w:r>
               <w:rPr>
@@ -4063,7 +4063,7 @@
                 <w:noProof/>
                 <w:webHidden/>
               </w:rPr>
-              <w:t>1</w:t>
+              <w:t>31</w:t>
             </w:r>
             <w:r>
               <w:rPr>
@@ -16555,7 +16555,7 @@
           <w:noProof/>
         </w:rPr>
         <w:drawing>
-          <wp:anchor distT="0" distB="0" distL="114300" distR="114300" simplePos="0" relativeHeight="251653120" behindDoc="0" locked="0" layoutInCell="1" allowOverlap="1" wp14:anchorId="1615FC88" wp14:editId="6E471368">
+          <wp:anchor distT="0" distB="0" distL="114300" distR="114300" simplePos="0" relativeHeight="251653120" behindDoc="0" locked="0" layoutInCell="1" allowOverlap="1" wp14:anchorId="1615FC88" wp14:editId="3F10ACE5">
             <wp:simplePos x="0" y="0"/>
             <wp:positionH relativeFrom="column">
               <wp:posOffset>1091413</wp:posOffset>
@@ -16743,7 +16743,49 @@
         <w:rPr>
           <w:rFonts w:ascii="Times New Roman" w:hAnsi="Times New Roman" w:cs="Times New Roman"/>
         </w:rPr>
-        <w:t xml:space="preserve">, dan dirasakan oleh pengguna saat berhadapan dengan metode pembelajaran konvensional. Diagram ini mengonfirmasi bahwa rasa frustrasi pengguna bersumber </w:t>
+        <w:t xml:space="preserve">, dan dirasakan oleh pengguna saat berhadapan dengan metode pembelajaran konvensional. Diagram ini mengonfirmasi bahwa rasa </w:t>
+      </w:r>
+      <w:proofErr w:type="spellStart"/>
+      <w:r>
+        <w:rPr>
+          <w:rFonts w:ascii="Times New Roman" w:hAnsi="Times New Roman" w:cs="Times New Roman"/>
+        </w:rPr>
+        <w:t>frustrasi</w:t>
+      </w:r>
+      <w:proofErr w:type="spellEnd"/>
+      <w:r>
+        <w:rPr>
+          <w:rFonts w:ascii="Times New Roman" w:hAnsi="Times New Roman" w:cs="Times New Roman"/>
+        </w:rPr>
+        <w:t xml:space="preserve"> </w:t>
+      </w:r>
+      <w:proofErr w:type="spellStart"/>
+      <w:r>
+        <w:rPr>
+          <w:rFonts w:ascii="Times New Roman" w:hAnsi="Times New Roman" w:cs="Times New Roman"/>
+        </w:rPr>
+        <w:t>pengguna</w:t>
+      </w:r>
+      <w:proofErr w:type="spellEnd"/>
+      <w:r>
+        <w:rPr>
+          <w:rFonts w:ascii="Times New Roman" w:hAnsi="Times New Roman" w:cs="Times New Roman"/>
+        </w:rPr>
+        <w:t xml:space="preserve"> </w:t>
+      </w:r>
+      <w:proofErr w:type="spellStart"/>
+      <w:r>
+        <w:rPr>
+          <w:rFonts w:ascii="Times New Roman" w:hAnsi="Times New Roman" w:cs="Times New Roman"/>
+        </w:rPr>
+        <w:t>bersumber</w:t>
+      </w:r>
+      <w:proofErr w:type="spellEnd"/>
+      <w:r>
+        <w:rPr>
+          <w:rFonts w:ascii="Times New Roman" w:hAnsi="Times New Roman" w:cs="Times New Roman"/>
+        </w:rPr>
+        <w:t xml:space="preserve"> </w:t>
       </w:r>
       <w:proofErr w:type="spellStart"/>
       <w:r>
@@ -18706,17 +18748,7 @@
                                   <w:color w:val="auto"/>
                                   <w:szCs w:val="24"/>
                                 </w:rPr>
-                                <w:t xml:space="preserve">User Flow </w:t>
-                              </w:r>
-                              <w:r>
-                                <w:rPr>
-                                  <w:rFonts w:ascii="Times New Roman" w:hAnsi="Times New Roman" w:cs="Times New Roman"/>
-                                  <w:i/>
-                                  <w:iCs w:val="0"/>
-                                  <w:color w:val="auto"/>
-                                  <w:szCs w:val="24"/>
-                                </w:rPr>
-                                <w:t>Navigasi Beranda Utama</w:t>
+                                <w:t>User Flow Navigasi Beranda Utama</w:t>
                               </w:r>
                               <w:bookmarkEnd w:id="55"/>
                             </w:p>
@@ -18812,17 +18844,7 @@
                             <w:color w:val="auto"/>
                             <w:szCs w:val="24"/>
                           </w:rPr>
-                          <w:t xml:space="preserve">User Flow </w:t>
-                        </w:r>
-                        <w:r>
-                          <w:rPr>
-                            <w:rFonts w:ascii="Times New Roman" w:hAnsi="Times New Roman" w:cs="Times New Roman"/>
-                            <w:i/>
-                            <w:iCs w:val="0"/>
-                            <w:color w:val="auto"/>
-                            <w:szCs w:val="24"/>
-                          </w:rPr>
-                          <w:t>Navigasi Beranda Utama</w:t>
+                          <w:t>User Flow Navigasi Beranda Utama</w:t>
                         </w:r>
                         <w:bookmarkEnd w:id="56"/>
                       </w:p>
@@ -19023,17 +19045,7 @@
                                 <w:color w:val="auto"/>
                                 <w:szCs w:val="24"/>
                               </w:rPr>
-                              <w:t xml:space="preserve">User Flow Proses </w:t>
-                            </w:r>
-                            <w:r>
-                              <w:rPr>
-                                <w:rFonts w:ascii="Times New Roman" w:hAnsi="Times New Roman" w:cs="Times New Roman"/>
-                                <w:i/>
-                                <w:iCs w:val="0"/>
-                                <w:color w:val="auto"/>
-                                <w:szCs w:val="24"/>
-                              </w:rPr>
-                              <w:t>Pemindaian (Scanning) dan Error</w:t>
+                              <w:t>User Flow Proses Pemindaian (Scanning) dan Error</w:t>
                             </w:r>
                             <w:bookmarkEnd w:id="57"/>
                           </w:p>
@@ -19099,17 +19111,7 @@
                           <w:color w:val="auto"/>
                           <w:szCs w:val="24"/>
                         </w:rPr>
-                        <w:t xml:space="preserve">User Flow Proses </w:t>
-                      </w:r>
-                      <w:r>
-                        <w:rPr>
-                          <w:rFonts w:ascii="Times New Roman" w:hAnsi="Times New Roman" w:cs="Times New Roman"/>
-                          <w:i/>
-                          <w:iCs w:val="0"/>
-                          <w:color w:val="auto"/>
-                          <w:szCs w:val="24"/>
-                        </w:rPr>
-                        <w:t>Pemindaian (Scanning) dan Error</w:t>
+                        <w:t>User Flow Proses Pemindaian (Scanning) dan Error</w:t>
                       </w:r>
                       <w:bookmarkEnd w:id="58"/>
                     </w:p>
@@ -19334,17 +19336,7 @@
                                 <w:color w:val="auto"/>
                                 <w:szCs w:val="24"/>
                               </w:rPr>
-                              <w:t xml:space="preserve">User Flow </w:t>
-                            </w:r>
-                            <w:r>
-                              <w:rPr>
-                                <w:rFonts w:ascii="Times New Roman" w:hAnsi="Times New Roman" w:cs="Times New Roman"/>
-                                <w:i/>
-                                <w:iCs w:val="0"/>
-                                <w:color w:val="auto"/>
-                                <w:szCs w:val="24"/>
-                              </w:rPr>
-                              <w:t>Interaksi AR Aktif &amp; Navigasi Keluar</w:t>
+                              <w:t>User Flow Interaksi AR Aktif &amp; Navigasi Keluar</w:t>
                             </w:r>
                             <w:bookmarkEnd w:id="59"/>
                           </w:p>
@@ -19410,17 +19402,7 @@
                           <w:color w:val="auto"/>
                           <w:szCs w:val="24"/>
                         </w:rPr>
-                        <w:t xml:space="preserve">User Flow </w:t>
-                      </w:r>
-                      <w:r>
-                        <w:rPr>
-                          <w:rFonts w:ascii="Times New Roman" w:hAnsi="Times New Roman" w:cs="Times New Roman"/>
-                          <w:i/>
-                          <w:iCs w:val="0"/>
-                          <w:color w:val="auto"/>
-                          <w:szCs w:val="24"/>
-                        </w:rPr>
-                        <w:t>Interaksi AR Aktif &amp; Navigasi Keluar</w:t>
+                        <w:t>User Flow Interaksi AR Aktif &amp; Navigasi Keluar</w:t>
                       </w:r>
                       <w:bookmarkEnd w:id="60"/>
                     </w:p>
@@ -20153,7 +20135,7 @@
           <w:noProof/>
         </w:rPr>
         <w:drawing>
-          <wp:anchor distT="0" distB="0" distL="114300" distR="114300" simplePos="0" relativeHeight="251674624" behindDoc="0" locked="0" layoutInCell="1" allowOverlap="1" wp14:anchorId="18E463A4" wp14:editId="409D515C">
+          <wp:anchor distT="0" distB="0" distL="114300" distR="114300" simplePos="0" relativeHeight="251674624" behindDoc="0" locked="0" layoutInCell="1" allowOverlap="1" wp14:anchorId="18E463A4" wp14:editId="39319AE9">
             <wp:simplePos x="0" y="0"/>
             <wp:positionH relativeFrom="column">
               <wp:posOffset>526415</wp:posOffset>
@@ -22718,7 +22700,7 @@
           <w:noProof/>
         </w:rPr>
         <w:drawing>
-          <wp:anchor distT="0" distB="0" distL="114300" distR="114300" simplePos="0" relativeHeight="251676672" behindDoc="0" locked="0" layoutInCell="1" allowOverlap="1" wp14:anchorId="58FB3A06" wp14:editId="13125040">
+          <wp:anchor distT="0" distB="0" distL="114300" distR="114300" simplePos="0" relativeHeight="251676672" behindDoc="0" locked="0" layoutInCell="1" allowOverlap="1" wp14:anchorId="58FB3A06" wp14:editId="7E8E6E7D">
             <wp:simplePos x="0" y="0"/>
             <wp:positionH relativeFrom="column">
               <wp:posOffset>949960</wp:posOffset>
@@ -23991,6 +23973,8 @@
     </w:p>
     <w:p>
       <w:pPr>
+        <w:spacing w:line="360" w:lineRule="auto"/>
+        <w:ind w:firstLine="709"/>
         <w:rPr>
           <w:rFonts w:ascii="Times New Roman" w:hAnsi="Times New Roman" w:cs="Times New Roman"/>
           <w:b/>
@@ -24005,6 +23989,8 @@
     </w:p>
     <w:p>
       <w:pPr>
+        <w:spacing w:line="360" w:lineRule="auto"/>
+        <w:ind w:firstLine="709"/>
         <w:rPr>
           <w:rFonts w:ascii="Times New Roman" w:hAnsi="Times New Roman" w:cs="Times New Roman"/>
           <w:b/>
@@ -24102,7 +24088,50 @@
         <w:rPr>
           <w:rFonts w:ascii="Times New Roman" w:hAnsi="Times New Roman" w:cs="Times New Roman"/>
         </w:rPr>
-        <w:t xml:space="preserve">Penerapan Fitur Deteksi Objek Pintar: Pada pengembangan jangka panjang, aplikasi disarankan untuk mulai mengadopsi teknologi Machine Learning. Dengan begitu, pengguna tidak perlu lagi bergantung penuh pada flashcard fisik; mereka bisa langsung menyorot kamera ke benda asli di sekitar mereka (misalnya menyorot kursi atau </w:t>
+        <w:lastRenderedPageBreak/>
+        <w:t xml:space="preserve">Penerapan Fitur Deteksi Objek Pintar: Pada pengembangan jangka panjang, aplikasi disarankan untuk mulai mengadopsi teknologi Machine Learning. Dengan begitu, pengguna tidak perlu lagi bergantung penuh pada flashcard fisik; mereka bisa langsung menyorot kamera ke benda asli di sekitar mereka (misalnya </w:t>
+      </w:r>
+      <w:proofErr w:type="spellStart"/>
+      <w:r>
+        <w:rPr>
+          <w:rFonts w:ascii="Times New Roman" w:hAnsi="Times New Roman" w:cs="Times New Roman"/>
+        </w:rPr>
+        <w:t>menyorot</w:t>
+      </w:r>
+      <w:proofErr w:type="spellEnd"/>
+      <w:r>
+        <w:rPr>
+          <w:rFonts w:ascii="Times New Roman" w:hAnsi="Times New Roman" w:cs="Times New Roman"/>
+        </w:rPr>
+        <w:t xml:space="preserve"> </w:t>
+      </w:r>
+      <w:proofErr w:type="spellStart"/>
+      <w:r>
+        <w:rPr>
+          <w:rFonts w:ascii="Times New Roman" w:hAnsi="Times New Roman" w:cs="Times New Roman"/>
+        </w:rPr>
+        <w:t>kursi</w:t>
+      </w:r>
+      <w:proofErr w:type="spellEnd"/>
+      <w:r>
+        <w:rPr>
+          <w:rFonts w:ascii="Times New Roman" w:hAnsi="Times New Roman" w:cs="Times New Roman"/>
+        </w:rPr>
+        <w:t xml:space="preserve"> </w:t>
+      </w:r>
+      <w:proofErr w:type="spellStart"/>
+      <w:r>
+        <w:rPr>
+          <w:rFonts w:ascii="Times New Roman" w:hAnsi="Times New Roman" w:cs="Times New Roman"/>
+        </w:rPr>
+        <w:t>atau</w:t>
+      </w:r>
+      <w:proofErr w:type="spellEnd"/>
+      <w:r>
+        <w:rPr>
+          <w:rFonts w:ascii="Times New Roman" w:hAnsi="Times New Roman" w:cs="Times New Roman"/>
+        </w:rPr>
+        <w:t xml:space="preserve"> </w:t>
       </w:r>
       <w:proofErr w:type="spellStart"/>
       <w:r>
@@ -24229,6 +24258,24 @@
           <w:rFonts w:ascii="Times New Roman" w:hAnsi="Times New Roman" w:cs="Times New Roman"/>
         </w:rPr>
         <w:t>.</w:t>
+      </w:r>
+    </w:p>
+    <w:p>
+      <w:pPr>
+        <w:spacing w:after="0"/>
+        <w:jc w:val="left"/>
+        <w:rPr>
+          <w:rFonts w:ascii="Times New Roman" w:eastAsiaTheme="majorEastAsia" w:hAnsi="Times New Roman" w:cstheme="majorBidi"/>
+          <w:b/>
+          <w:color w:val="000000" w:themeColor="text1"/>
+          <w:sz w:val="28"/>
+          <w:szCs w:val="32"/>
+        </w:rPr>
+      </w:pPr>
+      <w:bookmarkStart w:id="86" w:name="_Toc236233507"/>
+      <w:bookmarkStart w:id="87" w:name="_Toc236587073"/>
+      <w:r>
+        <w:br w:type="page"/>
       </w:r>
     </w:p>
     <w:p>
@@ -24240,8 +24287,6 @@
         </w:numPr>
         <w:ind w:left="432"/>
       </w:pPr>
-      <w:bookmarkStart w:id="86" w:name="_Toc236233507"/>
-      <w:bookmarkStart w:id="87" w:name="_Toc236587073"/>
       <w:r>
         <w:lastRenderedPageBreak/>
         <w:t>DAFTAR REFERENSI</w:t>
@@ -25363,6 +25408,7 @@
     </w:p>
     <w:p>
       <w:pPr>
+        <w:jc w:val="left"/>
         <w:rPr>
           <w:rFonts w:ascii="Times New Roman" w:hAnsi="Times New Roman" w:cs="Times New Roman"/>
         </w:rPr>
@@ -25376,15 +25422,25 @@
       <w:r>
         <w:t xml:space="preserve"> </w:t>
       </w:r>
-      <w:r>
-        <w:rPr>
-          <w:rFonts w:ascii="Times New Roman" w:hAnsi="Times New Roman" w:cs="Times New Roman"/>
-        </w:rPr>
-        <w:t>https://github.com/RafaelRangga/Tugas-Besar-AR-Isyarat-DIPL1.git</w:t>
-      </w:r>
-    </w:p>
-    <w:p>
-      <w:pPr>
+      <w:hyperlink r:id="rId37" w:history="1">
+        <w:r>
+          <w:rPr>
+            <w:rStyle w:val="Hyperlink"/>
+            <w:rFonts w:ascii="Times New Roman" w:hAnsi="Times New Roman" w:cs="Times New Roman"/>
+          </w:rPr>
+          <w:t>https://github.com/RafaelRangga/Tugas-Besar-AR-Isyarat-DIPL1.git</w:t>
+        </w:r>
+      </w:hyperlink>
+      <w:r>
+        <w:rPr>
+          <w:rFonts w:ascii="Times New Roman" w:hAnsi="Times New Roman" w:cs="Times New Roman"/>
+        </w:rPr>
+        <w:t xml:space="preserve"> </w:t>
+      </w:r>
+    </w:p>
+    <w:p>
+      <w:pPr>
+        <w:jc w:val="left"/>
         <w:rPr>
           <w:rFonts w:ascii="Times New Roman" w:hAnsi="Times New Roman" w:cs="Times New Roman"/>
         </w:rPr>
@@ -25394,6 +25450,27 @@
           <w:rFonts w:ascii="Times New Roman" w:hAnsi="Times New Roman" w:cs="Times New Roman"/>
         </w:rPr>
         <w:t>LINK VIDEO DEMONSTRASI (YOUTUBE):</w:t>
+      </w:r>
+      <w:r>
+        <w:rPr>
+          <w:rFonts w:ascii="Times New Roman" w:hAnsi="Times New Roman" w:cs="Times New Roman"/>
+        </w:rPr>
+        <w:t xml:space="preserve"> </w:t>
+      </w:r>
+      <w:hyperlink r:id="rId38" w:history="1">
+        <w:r>
+          <w:rPr>
+            <w:rStyle w:val="Hyperlink"/>
+            <w:rFonts w:ascii="Times New Roman" w:hAnsi="Times New Roman" w:cs="Times New Roman"/>
+          </w:rPr>
+          <w:t>https://youtu.be/TTCp_xB76_8?si=nzhBUVGKZ4qGAiLw</w:t>
+        </w:r>
+      </w:hyperlink>
+      <w:r>
+        <w:rPr>
+          <w:rFonts w:ascii="Times New Roman" w:hAnsi="Times New Roman" w:cs="Times New Roman"/>
+        </w:rPr>
+        <w:t xml:space="preserve"> </w:t>
       </w:r>
     </w:p>
     <w:p>
@@ -25448,198 +25525,6 @@
                 <pic:pic xmlns:pic="http://schemas.openxmlformats.org/drawingml/2006/picture">
                   <pic:nvPicPr>
                     <pic:cNvPr id="81884525" name=""/>
-                    <pic:cNvPicPr/>
-                  </pic:nvPicPr>
-                  <pic:blipFill>
-                    <a:blip r:embed="rId37" cstate="print">
-                      <a:extLst>
-                        <a:ext uri="{28A0092B-C50C-407E-A947-70E740481C1C}">
-                          <a14:useLocalDpi xmlns:a14="http://schemas.microsoft.com/office/drawing/2010/main" val="0"/>
-                        </a:ext>
-                      </a:extLst>
-                    </a:blip>
-                    <a:stretch>
-                      <a:fillRect/>
-                    </a:stretch>
-                  </pic:blipFill>
-                  <pic:spPr>
-                    <a:xfrm>
-                      <a:off x="0" y="0"/>
-                      <a:ext cx="5727700" cy="3221990"/>
-                    </a:xfrm>
-                    <a:prstGeom prst="rect">
-                      <a:avLst/>
-                    </a:prstGeom>
-                  </pic:spPr>
-                </pic:pic>
-              </a:graphicData>
-            </a:graphic>
-          </wp:anchor>
-        </w:drawing>
-      </w:r>
-      <w:r>
-        <w:rPr>
-          <w:rFonts w:ascii="Times New Roman" w:hAnsi="Times New Roman" w:cs="Times New Roman"/>
-          <w:b/>
-          <w:bCs/>
-          <w:sz w:val="32"/>
-          <w:szCs w:val="32"/>
-        </w:rPr>
-        <w:t xml:space="preserve">Lampiran Foto </w:t>
-      </w:r>
-      <w:proofErr w:type="spellStart"/>
-      <w:r>
-        <w:rPr>
-          <w:rFonts w:ascii="Times New Roman" w:hAnsi="Times New Roman" w:cs="Times New Roman"/>
-          <w:b/>
-          <w:bCs/>
-          <w:sz w:val="32"/>
-          <w:szCs w:val="32"/>
-        </w:rPr>
-        <w:t>Dokumentasi</w:t>
-      </w:r>
-      <w:proofErr w:type="spellEnd"/>
-      <w:r>
-        <w:rPr>
-          <w:rFonts w:ascii="Times New Roman" w:hAnsi="Times New Roman" w:cs="Times New Roman"/>
-          <w:b/>
-          <w:bCs/>
-          <w:sz w:val="32"/>
-          <w:szCs w:val="32"/>
-        </w:rPr>
-        <w:t xml:space="preserve"> </w:t>
-      </w:r>
-      <w:proofErr w:type="spellStart"/>
-      <w:r>
-        <w:rPr>
-          <w:rFonts w:ascii="Times New Roman" w:hAnsi="Times New Roman" w:cs="Times New Roman"/>
-          <w:b/>
-          <w:bCs/>
-          <w:sz w:val="32"/>
-          <w:szCs w:val="32"/>
-        </w:rPr>
-        <w:t>Pengerjaan</w:t>
-      </w:r>
-      <w:proofErr w:type="spellEnd"/>
-    </w:p>
-    <w:p>
-      <w:pPr>
-        <w:jc w:val="left"/>
-        <w:rPr>
-          <w:rFonts w:ascii="Times New Roman" w:hAnsi="Times New Roman" w:cs="Times New Roman"/>
-        </w:rPr>
-      </w:pPr>
-      <w:r>
-        <w:rPr>
-          <w:noProof/>
-        </w:rPr>
-        <w:drawing>
-          <wp:anchor distT="0" distB="0" distL="114300" distR="114300" simplePos="0" relativeHeight="251716608" behindDoc="0" locked="0" layoutInCell="1" allowOverlap="1" wp14:anchorId="6FC2BDC8" wp14:editId="157E9B5A">
-            <wp:simplePos x="0" y="0"/>
-            <wp:positionH relativeFrom="column">
-              <wp:posOffset>0</wp:posOffset>
-            </wp:positionH>
-            <wp:positionV relativeFrom="paragraph">
-              <wp:posOffset>3561080</wp:posOffset>
-            </wp:positionV>
-            <wp:extent cx="5727700" cy="3221990"/>
-            <wp:effectExtent l="0" t="0" r="6350" b="0"/>
-            <wp:wrapTopAndBottom/>
-            <wp:docPr id="1306177902" name="Picture 1"/>
-            <wp:cNvGraphicFramePr>
-              <a:graphicFrameLocks xmlns:a="http://schemas.openxmlformats.org/drawingml/2006/main" noChangeAspect="1"/>
-            </wp:cNvGraphicFramePr>
-            <a:graphic xmlns:a="http://schemas.openxmlformats.org/drawingml/2006/main">
-              <a:graphicData uri="http://schemas.openxmlformats.org/drawingml/2006/picture">
-                <pic:pic xmlns:pic="http://schemas.openxmlformats.org/drawingml/2006/picture">
-                  <pic:nvPicPr>
-                    <pic:cNvPr id="1306177902" name=""/>
-                    <pic:cNvPicPr/>
-                  </pic:nvPicPr>
-                  <pic:blipFill>
-                    <a:blip r:embed="rId38" cstate="print">
-                      <a:extLst>
-                        <a:ext uri="{28A0092B-C50C-407E-A947-70E740481C1C}">
-                          <a14:useLocalDpi xmlns:a14="http://schemas.microsoft.com/office/drawing/2010/main" val="0"/>
-                        </a:ext>
-                      </a:extLst>
-                    </a:blip>
-                    <a:stretch>
-                      <a:fillRect/>
-                    </a:stretch>
-                  </pic:blipFill>
-                  <pic:spPr>
-                    <a:xfrm>
-                      <a:off x="0" y="0"/>
-                      <a:ext cx="5727700" cy="3221990"/>
-                    </a:xfrm>
-                    <a:prstGeom prst="rect">
-                      <a:avLst/>
-                    </a:prstGeom>
-                  </pic:spPr>
-                </pic:pic>
-              </a:graphicData>
-            </a:graphic>
-          </wp:anchor>
-        </w:drawing>
-      </w:r>
-    </w:p>
-    <w:p>
-      <w:pPr>
-        <w:jc w:val="left"/>
-        <w:rPr>
-          <w:rFonts w:ascii="Times New Roman" w:hAnsi="Times New Roman" w:cs="Times New Roman"/>
-        </w:rPr>
-      </w:pPr>
-    </w:p>
-    <w:p>
-      <w:pPr>
-        <w:spacing w:after="0"/>
-        <w:jc w:val="left"/>
-        <w:rPr>
-          <w:rFonts w:ascii="Times New Roman" w:hAnsi="Times New Roman" w:cs="Times New Roman"/>
-        </w:rPr>
-      </w:pPr>
-      <w:r>
-        <w:rPr>
-          <w:rFonts w:ascii="Times New Roman" w:hAnsi="Times New Roman" w:cs="Times New Roman"/>
-        </w:rPr>
-        <w:br w:type="page"/>
-      </w:r>
-    </w:p>
-    <w:p>
-      <w:pPr>
-        <w:jc w:val="left"/>
-        <w:rPr>
-          <w:rFonts w:ascii="Times New Roman" w:hAnsi="Times New Roman" w:cs="Times New Roman"/>
-        </w:rPr>
-      </w:pPr>
-      <w:r>
-        <w:rPr>
-          <w:noProof/>
-        </w:rPr>
-        <w:lastRenderedPageBreak/>
-        <w:drawing>
-          <wp:anchor distT="0" distB="0" distL="114300" distR="114300" simplePos="0" relativeHeight="251718656" behindDoc="0" locked="0" layoutInCell="1" allowOverlap="1" wp14:anchorId="3C9399A3" wp14:editId="2466C41F">
-            <wp:simplePos x="0" y="0"/>
-            <wp:positionH relativeFrom="column">
-              <wp:posOffset>0</wp:posOffset>
-            </wp:positionH>
-            <wp:positionV relativeFrom="paragraph">
-              <wp:posOffset>3432810</wp:posOffset>
-            </wp:positionV>
-            <wp:extent cx="5727700" cy="3221990"/>
-            <wp:effectExtent l="0" t="0" r="6350" b="0"/>
-            <wp:wrapTopAndBottom/>
-            <wp:docPr id="1442580062" name="Picture 1"/>
-            <wp:cNvGraphicFramePr>
-              <a:graphicFrameLocks xmlns:a="http://schemas.openxmlformats.org/drawingml/2006/main" noChangeAspect="1"/>
-            </wp:cNvGraphicFramePr>
-            <a:graphic xmlns:a="http://schemas.openxmlformats.org/drawingml/2006/main">
-              <a:graphicData uri="http://schemas.openxmlformats.org/drawingml/2006/picture">
-                <pic:pic xmlns:pic="http://schemas.openxmlformats.org/drawingml/2006/picture">
-                  <pic:nvPicPr>
-                    <pic:cNvPr id="1442580062" name=""/>
                     <pic:cNvPicPr/>
                   </pic:nvPicPr>
                   <pic:blipFill>
@@ -25671,6 +25556,198 @@
       </w:r>
       <w:r>
         <w:rPr>
+          <w:rFonts w:ascii="Times New Roman" w:hAnsi="Times New Roman" w:cs="Times New Roman"/>
+          <w:b/>
+          <w:bCs/>
+          <w:sz w:val="32"/>
+          <w:szCs w:val="32"/>
+        </w:rPr>
+        <w:t xml:space="preserve">Lampiran Foto </w:t>
+      </w:r>
+      <w:proofErr w:type="spellStart"/>
+      <w:r>
+        <w:rPr>
+          <w:rFonts w:ascii="Times New Roman" w:hAnsi="Times New Roman" w:cs="Times New Roman"/>
+          <w:b/>
+          <w:bCs/>
+          <w:sz w:val="32"/>
+          <w:szCs w:val="32"/>
+        </w:rPr>
+        <w:t>Dokumentasi</w:t>
+      </w:r>
+      <w:proofErr w:type="spellEnd"/>
+      <w:r>
+        <w:rPr>
+          <w:rFonts w:ascii="Times New Roman" w:hAnsi="Times New Roman" w:cs="Times New Roman"/>
+          <w:b/>
+          <w:bCs/>
+          <w:sz w:val="32"/>
+          <w:szCs w:val="32"/>
+        </w:rPr>
+        <w:t xml:space="preserve"> </w:t>
+      </w:r>
+      <w:proofErr w:type="spellStart"/>
+      <w:r>
+        <w:rPr>
+          <w:rFonts w:ascii="Times New Roman" w:hAnsi="Times New Roman" w:cs="Times New Roman"/>
+          <w:b/>
+          <w:bCs/>
+          <w:sz w:val="32"/>
+          <w:szCs w:val="32"/>
+        </w:rPr>
+        <w:t>Pengerjaan</w:t>
+      </w:r>
+      <w:proofErr w:type="spellEnd"/>
+    </w:p>
+    <w:p>
+      <w:pPr>
+        <w:jc w:val="left"/>
+        <w:rPr>
+          <w:rFonts w:ascii="Times New Roman" w:hAnsi="Times New Roman" w:cs="Times New Roman"/>
+        </w:rPr>
+      </w:pPr>
+      <w:r>
+        <w:rPr>
+          <w:noProof/>
+        </w:rPr>
+        <w:drawing>
+          <wp:anchor distT="0" distB="0" distL="114300" distR="114300" simplePos="0" relativeHeight="251716608" behindDoc="0" locked="0" layoutInCell="1" allowOverlap="1" wp14:anchorId="6FC2BDC8" wp14:editId="157E9B5A">
+            <wp:simplePos x="0" y="0"/>
+            <wp:positionH relativeFrom="column">
+              <wp:posOffset>0</wp:posOffset>
+            </wp:positionH>
+            <wp:positionV relativeFrom="paragraph">
+              <wp:posOffset>3561080</wp:posOffset>
+            </wp:positionV>
+            <wp:extent cx="5727700" cy="3221990"/>
+            <wp:effectExtent l="0" t="0" r="6350" b="0"/>
+            <wp:wrapTopAndBottom/>
+            <wp:docPr id="1306177902" name="Picture 1"/>
+            <wp:cNvGraphicFramePr>
+              <a:graphicFrameLocks xmlns:a="http://schemas.openxmlformats.org/drawingml/2006/main" noChangeAspect="1"/>
+            </wp:cNvGraphicFramePr>
+            <a:graphic xmlns:a="http://schemas.openxmlformats.org/drawingml/2006/main">
+              <a:graphicData uri="http://schemas.openxmlformats.org/drawingml/2006/picture">
+                <pic:pic xmlns:pic="http://schemas.openxmlformats.org/drawingml/2006/picture">
+                  <pic:nvPicPr>
+                    <pic:cNvPr id="1306177902" name=""/>
+                    <pic:cNvPicPr/>
+                  </pic:nvPicPr>
+                  <pic:blipFill>
+                    <a:blip r:embed="rId40" cstate="print">
+                      <a:extLst>
+                        <a:ext uri="{28A0092B-C50C-407E-A947-70E740481C1C}">
+                          <a14:useLocalDpi xmlns:a14="http://schemas.microsoft.com/office/drawing/2010/main" val="0"/>
+                        </a:ext>
+                      </a:extLst>
+                    </a:blip>
+                    <a:stretch>
+                      <a:fillRect/>
+                    </a:stretch>
+                  </pic:blipFill>
+                  <pic:spPr>
+                    <a:xfrm>
+                      <a:off x="0" y="0"/>
+                      <a:ext cx="5727700" cy="3221990"/>
+                    </a:xfrm>
+                    <a:prstGeom prst="rect">
+                      <a:avLst/>
+                    </a:prstGeom>
+                  </pic:spPr>
+                </pic:pic>
+              </a:graphicData>
+            </a:graphic>
+          </wp:anchor>
+        </w:drawing>
+      </w:r>
+    </w:p>
+    <w:p>
+      <w:pPr>
+        <w:jc w:val="left"/>
+        <w:rPr>
+          <w:rFonts w:ascii="Times New Roman" w:hAnsi="Times New Roman" w:cs="Times New Roman"/>
+        </w:rPr>
+      </w:pPr>
+    </w:p>
+    <w:p>
+      <w:pPr>
+        <w:spacing w:after="0"/>
+        <w:jc w:val="left"/>
+        <w:rPr>
+          <w:rFonts w:ascii="Times New Roman" w:hAnsi="Times New Roman" w:cs="Times New Roman"/>
+        </w:rPr>
+      </w:pPr>
+      <w:r>
+        <w:rPr>
+          <w:rFonts w:ascii="Times New Roman" w:hAnsi="Times New Roman" w:cs="Times New Roman"/>
+        </w:rPr>
+        <w:br w:type="page"/>
+      </w:r>
+    </w:p>
+    <w:p>
+      <w:pPr>
+        <w:jc w:val="left"/>
+        <w:rPr>
+          <w:rFonts w:ascii="Times New Roman" w:hAnsi="Times New Roman" w:cs="Times New Roman"/>
+        </w:rPr>
+      </w:pPr>
+      <w:r>
+        <w:rPr>
+          <w:noProof/>
+        </w:rPr>
+        <w:lastRenderedPageBreak/>
+        <w:drawing>
+          <wp:anchor distT="0" distB="0" distL="114300" distR="114300" simplePos="0" relativeHeight="251718656" behindDoc="0" locked="0" layoutInCell="1" allowOverlap="1" wp14:anchorId="3C9399A3" wp14:editId="2466C41F">
+            <wp:simplePos x="0" y="0"/>
+            <wp:positionH relativeFrom="column">
+              <wp:posOffset>0</wp:posOffset>
+            </wp:positionH>
+            <wp:positionV relativeFrom="paragraph">
+              <wp:posOffset>3432810</wp:posOffset>
+            </wp:positionV>
+            <wp:extent cx="5727700" cy="3221990"/>
+            <wp:effectExtent l="0" t="0" r="6350" b="0"/>
+            <wp:wrapTopAndBottom/>
+            <wp:docPr id="1442580062" name="Picture 1"/>
+            <wp:cNvGraphicFramePr>
+              <a:graphicFrameLocks xmlns:a="http://schemas.openxmlformats.org/drawingml/2006/main" noChangeAspect="1"/>
+            </wp:cNvGraphicFramePr>
+            <a:graphic xmlns:a="http://schemas.openxmlformats.org/drawingml/2006/main">
+              <a:graphicData uri="http://schemas.openxmlformats.org/drawingml/2006/picture">
+                <pic:pic xmlns:pic="http://schemas.openxmlformats.org/drawingml/2006/picture">
+                  <pic:nvPicPr>
+                    <pic:cNvPr id="1442580062" name=""/>
+                    <pic:cNvPicPr/>
+                  </pic:nvPicPr>
+                  <pic:blipFill>
+                    <a:blip r:embed="rId41" cstate="print">
+                      <a:extLst>
+                        <a:ext uri="{28A0092B-C50C-407E-A947-70E740481C1C}">
+                          <a14:useLocalDpi xmlns:a14="http://schemas.microsoft.com/office/drawing/2010/main" val="0"/>
+                        </a:ext>
+                      </a:extLst>
+                    </a:blip>
+                    <a:stretch>
+                      <a:fillRect/>
+                    </a:stretch>
+                  </pic:blipFill>
+                  <pic:spPr>
+                    <a:xfrm>
+                      <a:off x="0" y="0"/>
+                      <a:ext cx="5727700" cy="3221990"/>
+                    </a:xfrm>
+                    <a:prstGeom prst="rect">
+                      <a:avLst/>
+                    </a:prstGeom>
+                  </pic:spPr>
+                </pic:pic>
+              </a:graphicData>
+            </a:graphic>
+          </wp:anchor>
+        </w:drawing>
+      </w:r>
+      <w:r>
+        <w:rPr>
           <w:noProof/>
         </w:rPr>
         <w:drawing>
@@ -25697,7 +25774,7 @@
                     <pic:cNvPicPr/>
                   </pic:nvPicPr>
                   <pic:blipFill rotWithShape="1">
-                    <a:blip r:embed="rId40" cstate="print">
+                    <a:blip r:embed="rId42" cstate="print">
                       <a:extLst>
                         <a:ext uri="{28A0092B-C50C-407E-A947-70E740481C1C}">
                           <a14:useLocalDpi xmlns:a14="http://schemas.microsoft.com/office/drawing/2010/main" val="0"/>
@@ -25819,7 +25896,7 @@
         </w:rPr>
         <w:lastRenderedPageBreak/>
         <w:drawing>
-          <wp:anchor distT="0" distB="0" distL="114300" distR="114300" simplePos="0" relativeHeight="251729920" behindDoc="0" locked="0" layoutInCell="1" allowOverlap="1" wp14:anchorId="37B051E7" wp14:editId="2B3B0A99">
+          <wp:anchor distT="0" distB="0" distL="114300" distR="114300" simplePos="0" relativeHeight="251729920" behindDoc="0" locked="0" layoutInCell="1" allowOverlap="1" wp14:anchorId="37B051E7" wp14:editId="3E55D9B9">
             <wp:simplePos x="0" y="0"/>
             <wp:positionH relativeFrom="column">
               <wp:posOffset>0</wp:posOffset>
@@ -25842,7 +25919,7 @@
                     <pic:cNvPicPr/>
                   </pic:nvPicPr>
                   <pic:blipFill>
-                    <a:blip r:embed="rId41" cstate="print">
+                    <a:blip r:embed="rId43" cstate="print">
                       <a:extLst>
                         <a:ext uri="{28A0092B-C50C-407E-A947-70E740481C1C}">
                           <a14:useLocalDpi xmlns:a14="http://schemas.microsoft.com/office/drawing/2010/main" val="0"/>
@@ -25874,7 +25951,7 @@
           <w:noProof/>
         </w:rPr>
         <w:drawing>
-          <wp:anchor distT="0" distB="0" distL="114300" distR="114300" simplePos="0" relativeHeight="251720704" behindDoc="0" locked="0" layoutInCell="1" allowOverlap="1" wp14:anchorId="33EC4EA4" wp14:editId="6E9D7FC1">
+          <wp:anchor distT="0" distB="0" distL="114300" distR="114300" simplePos="0" relativeHeight="251720704" behindDoc="0" locked="0" layoutInCell="1" allowOverlap="1" wp14:anchorId="33EC4EA4" wp14:editId="3E578353">
             <wp:simplePos x="0" y="0"/>
             <wp:positionH relativeFrom="column">
               <wp:posOffset>0</wp:posOffset>
@@ -25897,7 +25974,7 @@
                     <pic:cNvPicPr/>
                   </pic:nvPicPr>
                   <pic:blipFill>
-                    <a:blip r:embed="rId42" cstate="print">
+                    <a:blip r:embed="rId44" cstate="print">
                       <a:extLst>
                         <a:ext uri="{28A0092B-C50C-407E-A947-70E740481C1C}">
                           <a14:useLocalDpi xmlns:a14="http://schemas.microsoft.com/office/drawing/2010/main" val="0"/>
@@ -26022,7 +26099,7 @@
                     <pic:cNvPicPr/>
                   </pic:nvPicPr>
                   <pic:blipFill>
-                    <a:blip r:embed="rId43" cstate="print">
+                    <a:blip r:embed="rId45" cstate="print">
                       <a:extLst>
                         <a:ext uri="{28A0092B-C50C-407E-A947-70E740481C1C}">
                           <a14:useLocalDpi xmlns:a14="http://schemas.microsoft.com/office/drawing/2010/main" val="0"/>
@@ -26087,7 +26164,7 @@
                     <pic:cNvPicPr/>
                   </pic:nvPicPr>
                   <pic:blipFill>
-                    <a:blip r:embed="rId44" cstate="print">
+                    <a:blip r:embed="rId46" cstate="print">
                       <a:extLst>
                         <a:ext uri="{28A0092B-C50C-407E-A947-70E740481C1C}">
                           <a14:useLocalDpi xmlns:a14="http://schemas.microsoft.com/office/drawing/2010/main" val="0"/>
@@ -26472,7 +26549,7 @@
                     <pic:cNvPicPr/>
                   </pic:nvPicPr>
                   <pic:blipFill>
-                    <a:blip r:embed="rId45" cstate="print">
+                    <a:blip r:embed="rId47" cstate="print">
                       <a:extLst>
                         <a:ext uri="{28A0092B-C50C-407E-A947-70E740481C1C}">
                           <a14:useLocalDpi xmlns:a14="http://schemas.microsoft.com/office/drawing/2010/main" val="0"/>
@@ -26545,7 +26622,7 @@
                     <pic:cNvPicPr/>
                   </pic:nvPicPr>
                   <pic:blipFill>
-                    <a:blip r:embed="rId46" cstate="print">
+                    <a:blip r:embed="rId48" cstate="print">
                       <a:extLst>
                         <a:ext uri="{28A0092B-C50C-407E-A947-70E740481C1C}">
                           <a14:useLocalDpi xmlns:a14="http://schemas.microsoft.com/office/drawing/2010/main" val="0"/>
@@ -26729,7 +26806,7 @@
                     <pic:cNvPicPr/>
                   </pic:nvPicPr>
                   <pic:blipFill>
-                    <a:blip r:embed="rId47">
+                    <a:blip r:embed="rId49">
                       <a:extLst>
                         <a:ext uri="{28A0092B-C50C-407E-A947-70E740481C1C}">
                           <a14:useLocalDpi xmlns:a14="http://schemas.microsoft.com/office/drawing/2010/main" val="0"/>
@@ -26796,7 +26873,7 @@
                     <pic:cNvPicPr/>
                   </pic:nvPicPr>
                   <pic:blipFill>
-                    <a:blip r:embed="rId48">
+                    <a:blip r:embed="rId50">
                       <a:extLst>
                         <a:ext uri="{28A0092B-C50C-407E-A947-70E740481C1C}">
                           <a14:useLocalDpi xmlns:a14="http://schemas.microsoft.com/office/drawing/2010/main" val="0"/>
@@ -26974,7 +27051,7 @@
                     <pic:cNvPicPr/>
                   </pic:nvPicPr>
                   <pic:blipFill>
-                    <a:blip r:embed="rId49">
+                    <a:blip r:embed="rId51">
                       <a:extLst>
                         <a:ext uri="{28A0092B-C50C-407E-A947-70E740481C1C}">
                           <a14:useLocalDpi xmlns:a14="http://schemas.microsoft.com/office/drawing/2010/main" val="0"/>

</xml_diff>